<commit_message>
Brand copy review docx
</commit_message>
<xml_diff>
--- a/FounderNexus-v2-copy-review.docx
+++ b/FounderNexus-v2-copy-review.docx
@@ -11,10 +11,10 @@
         <w:rPr>
           <w:rFonts w:ascii="Arial" w:hAnsi="Arial"/>
           <w:b/>
-          <w:color w:val="0F2B46"/>
-          <w:sz w:val="44"/>
+          <w:color w:val="007BE4"/>
+          <w:sz w:val="24"/>
         </w:rPr>
-        <w:t>FounderNexus Homepage V2 Copy Review</w:t>
+        <w:t>FounderNexus</w:t>
       </w:r>
     </w:p>
     <w:p>
@@ -24,60 +24,224 @@
       </w:pPr>
       <w:r>
         <w:rPr>
+          <w:rFonts w:ascii="Arial" w:hAnsi="Arial"/>
+          <w:b/>
+          <w:color w:val="01052A"/>
+          <w:sz w:val="48"/>
+        </w:rPr>
+        <w:t>Homepage V2 Copy Review</w:t>
+      </w:r>
+    </w:p>
+    <w:p>
+      <w:pPr>
+        <w:spacing w:line="259" w:lineRule="auto"/>
+        <w:jc w:val="center"/>
+      </w:pPr>
+      <w:r>
+        <w:rPr>
           <w:i/>
+          <w:color w:val="56646F"/>
         </w:rPr>
         <w:t>Draft sections and copy for markup</w:t>
       </w:r>
     </w:p>
+    <w:tbl>
+      <w:tblPr>
+        <w:tblW w:type="auto" w:w="0"/>
+        <w:tblLayout w:type="autofit"/>
+        <w:tblLook w:firstColumn="1" w:firstRow="1" w:lastColumn="0" w:lastRow="0" w:noHBand="0" w:noVBand="1" w:val="04A0"/>
+      </w:tblPr>
+      <w:tblGrid>
+        <w:gridCol w:w="4896"/>
+        <w:gridCol w:w="4896"/>
+      </w:tblGrid>
+      <w:tr>
+        <w:tc>
+          <w:tcPr>
+            <w:tcW w:type="dxa" w:w="4896"/>
+            <w:shd w:fill="F1F8FF"/>
+            <w:tcBorders>
+              <w:top w:val="single" w:sz="4" w:space="0" w:color="D3D6DA"/>
+              <w:left w:val="single" w:sz="4" w:space="0" w:color="D3D6DA"/>
+              <w:bottom w:val="single" w:sz="4" w:space="0" w:color="D3D6DA"/>
+              <w:right w:val="single" w:sz="4" w:space="0" w:color="D3D6DA"/>
+            </w:tcBorders>
+            <w:tcMar>
+              <w:top w:w="140" w:type="dxa"/>
+              <w:start w:w="140" w:type="dxa"/>
+              <w:bottom w:w="140" w:type="dxa"/>
+              <w:end w:w="140" w:type="dxa"/>
+            </w:tcMar>
+          </w:tcPr>
+          <w:p>
+            <w:r>
+              <w:rPr>
+                <w:rFonts w:ascii="Arial" w:hAnsi="Arial"/>
+                <w:b/>
+                <w:color w:val="061B2C"/>
+                <w:sz w:val="19"/>
+              </w:rPr>
+              <w:t>Source draft</w:t>
+            </w:r>
+          </w:p>
+        </w:tc>
+        <w:tc>
+          <w:tcPr>
+            <w:tcW w:type="dxa" w:w="4896"/>
+            <w:shd w:fill="F1F8FF"/>
+            <w:tcBorders>
+              <w:top w:val="single" w:sz="4" w:space="0" w:color="D3D6DA"/>
+              <w:left w:val="single" w:sz="4" w:space="0" w:color="D3D6DA"/>
+              <w:bottom w:val="single" w:sz="4" w:space="0" w:color="D3D6DA"/>
+              <w:right w:val="single" w:sz="4" w:space="0" w:color="D3D6DA"/>
+            </w:tcBorders>
+            <w:tcMar>
+              <w:top w:w="140" w:type="dxa"/>
+              <w:start w:w="140" w:type="dxa"/>
+              <w:bottom w:w="140" w:type="dxa"/>
+              <w:end w:w="140" w:type="dxa"/>
+            </w:tcMar>
+          </w:tcPr>
+          <w:p>
+            <w:r>
+              <w:rPr>
+                <w:rFonts w:ascii="Arial" w:hAnsi="Arial"/>
+                <w:color w:val="061B2C"/>
+                <w:sz w:val="19"/>
+              </w:rPr>
+              <w:t>https://foundernexus.github.io/fn-site-mockups/</w:t>
+            </w:r>
+          </w:p>
+        </w:tc>
+      </w:tr>
+      <w:tr>
+        <w:tc>
+          <w:tcPr>
+            <w:tcW w:type="dxa" w:w="4896"/>
+            <w:shd w:fill="F1F8FF"/>
+            <w:tcBorders>
+              <w:top w:val="single" w:sz="4" w:space="0" w:color="D3D6DA"/>
+              <w:left w:val="single" w:sz="4" w:space="0" w:color="D3D6DA"/>
+              <w:bottom w:val="single" w:sz="4" w:space="0" w:color="D3D6DA"/>
+              <w:right w:val="single" w:sz="4" w:space="0" w:color="D3D6DA"/>
+            </w:tcBorders>
+            <w:tcMar>
+              <w:top w:w="140" w:type="dxa"/>
+              <w:start w:w="140" w:type="dxa"/>
+              <w:bottom w:w="140" w:type="dxa"/>
+              <w:end w:w="140" w:type="dxa"/>
+            </w:tcMar>
+          </w:tcPr>
+          <w:p>
+            <w:r>
+              <w:rPr>
+                <w:rFonts w:ascii="Arial" w:hAnsi="Arial"/>
+                <w:b/>
+                <w:color w:val="061B2C"/>
+                <w:sz w:val="19"/>
+              </w:rPr>
+              <w:t>Local source</w:t>
+            </w:r>
+          </w:p>
+        </w:tc>
+        <w:tc>
+          <w:tcPr>
+            <w:tcW w:type="dxa" w:w="4896"/>
+            <w:shd w:fill="F1F8FF"/>
+            <w:tcBorders>
+              <w:top w:val="single" w:sz="4" w:space="0" w:color="D3D6DA"/>
+              <w:left w:val="single" w:sz="4" w:space="0" w:color="D3D6DA"/>
+              <w:bottom w:val="single" w:sz="4" w:space="0" w:color="D3D6DA"/>
+              <w:right w:val="single" w:sz="4" w:space="0" w:color="D3D6DA"/>
+            </w:tcBorders>
+            <w:tcMar>
+              <w:top w:w="140" w:type="dxa"/>
+              <w:start w:w="140" w:type="dxa"/>
+              <w:bottom w:w="140" w:type="dxa"/>
+              <w:end w:w="140" w:type="dxa"/>
+            </w:tcMar>
+          </w:tcPr>
+          <w:p>
+            <w:r>
+              <w:rPr>
+                <w:rFonts w:ascii="Arial" w:hAnsi="Arial"/>
+                <w:color w:val="061B2C"/>
+                <w:sz w:val="19"/>
+              </w:rPr>
+              <w:t>/Users/robroyhobbs/fn-site-mockups/index.html</w:t>
+            </w:r>
+          </w:p>
+        </w:tc>
+      </w:tr>
+      <w:tr>
+        <w:tc>
+          <w:tcPr>
+            <w:tcW w:type="dxa" w:w="4896"/>
+            <w:shd w:fill="F1F8FF"/>
+            <w:tcBorders>
+              <w:top w:val="single" w:sz="4" w:space="0" w:color="D3D6DA"/>
+              <w:left w:val="single" w:sz="4" w:space="0" w:color="D3D6DA"/>
+              <w:bottom w:val="single" w:sz="4" w:space="0" w:color="D3D6DA"/>
+              <w:right w:val="single" w:sz="4" w:space="0" w:color="D3D6DA"/>
+            </w:tcBorders>
+            <w:tcMar>
+              <w:top w:w="140" w:type="dxa"/>
+              <w:start w:w="140" w:type="dxa"/>
+              <w:bottom w:w="140" w:type="dxa"/>
+              <w:end w:w="140" w:type="dxa"/>
+            </w:tcMar>
+          </w:tcPr>
+          <w:p>
+            <w:r>
+              <w:rPr>
+                <w:rFonts w:ascii="Arial" w:hAnsi="Arial"/>
+                <w:b/>
+                <w:color w:val="061B2C"/>
+                <w:sz w:val="19"/>
+              </w:rPr>
+              <w:t>Generated from</w:t>
+            </w:r>
+          </w:p>
+        </w:tc>
+        <w:tc>
+          <w:tcPr>
+            <w:tcW w:type="dxa" w:w="4896"/>
+            <w:shd w:fill="F1F8FF"/>
+            <w:tcBorders>
+              <w:top w:val="single" w:sz="4" w:space="0" w:color="D3D6DA"/>
+              <w:left w:val="single" w:sz="4" w:space="0" w:color="D3D6DA"/>
+              <w:bottom w:val="single" w:sz="4" w:space="0" w:color="D3D6DA"/>
+              <w:right w:val="single" w:sz="4" w:space="0" w:color="D3D6DA"/>
+            </w:tcBorders>
+            <w:tcMar>
+              <w:top w:w="140" w:type="dxa"/>
+              <w:start w:w="140" w:type="dxa"/>
+              <w:bottom w:w="140" w:type="dxa"/>
+              <w:end w:w="140" w:type="dxa"/>
+            </w:tcMar>
+          </w:tcPr>
+          <w:p>
+            <w:r>
+              <w:rPr>
+                <w:rFonts w:ascii="Arial" w:hAnsi="Arial"/>
+                <w:color w:val="061B2C"/>
+                <w:sz w:val="19"/>
+              </w:rPr>
+              <w:t>Current draft HTML</w:t>
+            </w:r>
+          </w:p>
+        </w:tc>
+      </w:tr>
+    </w:tbl>
     <w:p>
       <w:pPr>
+        <w:shd w:fill="F1F8FF"/>
         <w:spacing w:line="259" w:lineRule="auto"/>
       </w:pPr>
       <w:r>
         <w:rPr>
           <w:b/>
-        </w:rPr>
-        <w:t xml:space="preserve">Source draft: </w:t>
-      </w:r>
-      <w:r>
-        <w:t>https://foundernexus.github.io/fn-site-mockups/</w:t>
-      </w:r>
-    </w:p>
-    <w:p>
-      <w:pPr>
-        <w:spacing w:line="259" w:lineRule="auto"/>
-      </w:pPr>
-      <w:r>
-        <w:rPr>
-          <w:b/>
-        </w:rPr>
-        <w:t xml:space="preserve">Local source: </w:t>
-      </w:r>
-      <w:r>
-        <w:t>/Users/robroyhobbs/fn-site-mockups/index.html</w:t>
-      </w:r>
-    </w:p>
-    <w:p>
-      <w:pPr>
-        <w:spacing w:line="259" w:lineRule="auto"/>
-      </w:pPr>
-      <w:r>
-        <w:rPr>
-          <w:b/>
-        </w:rPr>
-        <w:t xml:space="preserve">Generated from: </w:t>
-      </w:r>
-      <w:r>
-        <w:t>Current draft HTML</w:t>
-      </w:r>
-    </w:p>
-    <w:p>
-      <w:pPr>
-        <w:spacing w:line="259" w:lineRule="auto"/>
-      </w:pPr>
-      <w:r>
-        <w:rPr>
-          <w:b/>
+          <w:color w:val="061B2C"/>
         </w:rPr>
         <w:t xml:space="preserve">Reviewer note: </w:t>
       </w:r>
@@ -88,6 +252,9 @@
     <w:p>
       <w:pPr>
         <w:pStyle w:val="Heading1"/>
+        <w:pBdr>
+          <w:bottom w:val="single" w:sz="8" w:space="6" w:color="D3D6DA"/>
+        </w:pBdr>
         <w:spacing w:line="259" w:lineRule="auto"/>
       </w:pPr>
       <w:r>
@@ -101,6 +268,7 @@
       <w:r>
         <w:rPr>
           <w:b/>
+          <w:color w:val="061B2C"/>
         </w:rPr>
         <w:t xml:space="preserve">Location: </w:t>
       </w:r>
@@ -115,6 +283,7 @@
       <w:r>
         <w:rPr>
           <w:b/>
+          <w:color w:val="061B2C"/>
         </w:rPr>
         <w:t xml:space="preserve">Navigation links: </w:t>
       </w:r>
@@ -125,6 +294,9 @@
     <w:p>
       <w:pPr>
         <w:pStyle w:val="Heading1"/>
+        <w:pBdr>
+          <w:bottom w:val="single" w:sz="8" w:space="6" w:color="D3D6DA"/>
+        </w:pBdr>
         <w:spacing w:line="259" w:lineRule="auto"/>
       </w:pPr>
       <w:r>
@@ -138,6 +310,7 @@
       <w:r>
         <w:rPr>
           <w:b/>
+          <w:color w:val="061B2C"/>
         </w:rPr>
         <w:t xml:space="preserve">Eyebrow: </w:t>
       </w:r>
@@ -152,6 +325,7 @@
       <w:r>
         <w:rPr>
           <w:b/>
+          <w:color w:val="061B2C"/>
         </w:rPr>
         <w:t xml:space="preserve">Headline: </w:t>
       </w:r>
@@ -182,6 +356,7 @@
       <w:r>
         <w:rPr>
           <w:b/>
+          <w:color w:val="061B2C"/>
         </w:rPr>
         <w:t xml:space="preserve">Primary actions: </w:t>
       </w:r>
@@ -192,6 +367,9 @@
     <w:p>
       <w:pPr>
         <w:pStyle w:val="Heading1"/>
+        <w:pBdr>
+          <w:bottom w:val="single" w:sz="8" w:space="6" w:color="D3D6DA"/>
+        </w:pBdr>
         <w:spacing w:line="259" w:lineRule="auto"/>
       </w:pPr>
       <w:r>
@@ -205,6 +383,7 @@
       <w:r>
         <w:rPr>
           <w:b/>
+          <w:color w:val="061B2C"/>
         </w:rPr>
         <w:t xml:space="preserve">Section label: </w:t>
       </w:r>
@@ -219,6 +398,7 @@
       <w:r>
         <w:rPr>
           <w:b/>
+          <w:color w:val="061B2C"/>
         </w:rPr>
         <w:t xml:space="preserve">Headline: </w:t>
       </w:r>
@@ -241,6 +421,7 @@
       <w:r>
         <w:rPr>
           <w:b/>
+          <w:color w:val="061B2C"/>
         </w:rPr>
         <w:t xml:space="preserve">Panel label: </w:t>
       </w:r>
@@ -264,6 +445,7 @@
       <w:r>
         <w:rPr>
           <w:b/>
+          <w:color w:val="061B2C"/>
         </w:rPr>
         <w:t xml:space="preserve">Panel label: </w:t>
       </w:r>
@@ -302,6 +484,7 @@
       <w:r>
         <w:rPr>
           <w:b/>
+          <w:color w:val="061B2C"/>
         </w:rPr>
         <w:t xml:space="preserve">Calculator result labels: </w:t>
       </w:r>
@@ -312,6 +495,9 @@
     <w:p>
       <w:pPr>
         <w:pStyle w:val="Heading1"/>
+        <w:pBdr>
+          <w:bottom w:val="single" w:sz="8" w:space="6" w:color="D3D6DA"/>
+        </w:pBdr>
         <w:spacing w:line="259" w:lineRule="auto"/>
       </w:pPr>
       <w:r>
@@ -325,6 +511,7 @@
       <w:r>
         <w:rPr>
           <w:b/>
+          <w:color w:val="061B2C"/>
         </w:rPr>
         <w:t xml:space="preserve">Section label: </w:t>
       </w:r>
@@ -339,6 +526,7 @@
       <w:r>
         <w:rPr>
           <w:b/>
+          <w:color w:val="061B2C"/>
         </w:rPr>
         <w:t xml:space="preserve">Headline: </w:t>
       </w:r>
@@ -398,6 +586,9 @@
     <w:p>
       <w:pPr>
         <w:pStyle w:val="Heading1"/>
+        <w:pBdr>
+          <w:bottom w:val="single" w:sz="8" w:space="6" w:color="D3D6DA"/>
+        </w:pBdr>
         <w:spacing w:line="259" w:lineRule="auto"/>
       </w:pPr>
       <w:r>
@@ -411,6 +602,7 @@
       <w:r>
         <w:rPr>
           <w:b/>
+          <w:color w:val="061B2C"/>
         </w:rPr>
         <w:t xml:space="preserve">Section label: </w:t>
       </w:r>
@@ -425,6 +617,7 @@
       <w:r>
         <w:rPr>
           <w:b/>
+          <w:color w:val="061B2C"/>
         </w:rPr>
         <w:t xml:space="preserve">Headline: </w:t>
       </w:r>
@@ -537,6 +730,9 @@
     <w:p>
       <w:pPr>
         <w:pStyle w:val="Heading1"/>
+        <w:pBdr>
+          <w:bottom w:val="single" w:sz="8" w:space="6" w:color="D3D6DA"/>
+        </w:pBdr>
         <w:spacing w:line="259" w:lineRule="auto"/>
       </w:pPr>
       <w:r>
@@ -550,6 +746,7 @@
       <w:r>
         <w:rPr>
           <w:b/>
+          <w:color w:val="061B2C"/>
         </w:rPr>
         <w:t xml:space="preserve">Section label: </w:t>
       </w:r>
@@ -564,6 +761,7 @@
       <w:r>
         <w:rPr>
           <w:b/>
+          <w:color w:val="061B2C"/>
         </w:rPr>
         <w:t xml:space="preserve">Headline: </w:t>
       </w:r>
@@ -650,6 +848,9 @@
     <w:p>
       <w:pPr>
         <w:pStyle w:val="Heading1"/>
+        <w:pBdr>
+          <w:bottom w:val="single" w:sz="8" w:space="6" w:color="D3D6DA"/>
+        </w:pBdr>
         <w:spacing w:line="259" w:lineRule="auto"/>
       </w:pPr>
       <w:r>
@@ -663,6 +864,7 @@
       <w:r>
         <w:rPr>
           <w:b/>
+          <w:color w:val="061B2C"/>
         </w:rPr>
         <w:t xml:space="preserve">Section label: </w:t>
       </w:r>
@@ -677,6 +879,7 @@
       <w:r>
         <w:rPr>
           <w:b/>
+          <w:color w:val="061B2C"/>
         </w:rPr>
         <w:t xml:space="preserve">Headline: </w:t>
       </w:r>
@@ -746,6 +949,9 @@
     <w:p>
       <w:pPr>
         <w:pStyle w:val="Heading1"/>
+        <w:pBdr>
+          <w:bottom w:val="single" w:sz="8" w:space="6" w:color="D3D6DA"/>
+        </w:pBdr>
         <w:spacing w:line="259" w:lineRule="auto"/>
       </w:pPr>
       <w:r>
@@ -759,6 +965,7 @@
       <w:r>
         <w:rPr>
           <w:b/>
+          <w:color w:val="061B2C"/>
         </w:rPr>
         <w:t xml:space="preserve">Section label: </w:t>
       </w:r>
@@ -773,6 +980,7 @@
       <w:r>
         <w:rPr>
           <w:b/>
+          <w:color w:val="061B2C"/>
         </w:rPr>
         <w:t xml:space="preserve">Headline: </w:t>
       </w:r>
@@ -876,6 +1084,9 @@
     <w:p>
       <w:pPr>
         <w:pStyle w:val="Heading1"/>
+        <w:pBdr>
+          <w:bottom w:val="single" w:sz="8" w:space="6" w:color="D3D6DA"/>
+        </w:pBdr>
         <w:spacing w:line="259" w:lineRule="auto"/>
       </w:pPr>
       <w:r>
@@ -889,6 +1100,7 @@
       <w:r>
         <w:rPr>
           <w:b/>
+          <w:color w:val="061B2C"/>
         </w:rPr>
         <w:t xml:space="preserve">Section label: </w:t>
       </w:r>
@@ -903,6 +1115,7 @@
       <w:r>
         <w:rPr>
           <w:b/>
+          <w:color w:val="061B2C"/>
         </w:rPr>
         <w:t xml:space="preserve">Headline: </w:t>
       </w:r>
@@ -929,6 +1142,9 @@
     <w:p>
       <w:pPr>
         <w:pStyle w:val="Heading1"/>
+        <w:pBdr>
+          <w:bottom w:val="single" w:sz="8" w:space="6" w:color="D3D6DA"/>
+        </w:pBdr>
         <w:spacing w:line="259" w:lineRule="auto"/>
       </w:pPr>
       <w:r>
@@ -942,6 +1158,7 @@
       <w:r>
         <w:rPr>
           <w:b/>
+          <w:color w:val="061B2C"/>
         </w:rPr>
         <w:t xml:space="preserve">Section label: </w:t>
       </w:r>
@@ -956,6 +1173,7 @@
       <w:r>
         <w:rPr>
           <w:b/>
+          <w:color w:val="061B2C"/>
         </w:rPr>
         <w:t xml:space="preserve">Headline: </w:t>
       </w:r>
@@ -1116,6 +1334,9 @@
     <w:p>
       <w:pPr>
         <w:pStyle w:val="Heading1"/>
+        <w:pBdr>
+          <w:bottom w:val="single" w:sz="8" w:space="6" w:color="D3D6DA"/>
+        </w:pBdr>
         <w:spacing w:line="259" w:lineRule="auto"/>
       </w:pPr>
       <w:r>
@@ -1129,6 +1350,7 @@
       <w:r>
         <w:rPr>
           <w:b/>
+          <w:color w:val="061B2C"/>
         </w:rPr>
         <w:t xml:space="preserve">Section label: </w:t>
       </w:r>
@@ -1143,6 +1365,7 @@
       <w:r>
         <w:rPr>
           <w:b/>
+          <w:color w:val="061B2C"/>
         </w:rPr>
         <w:t xml:space="preserve">Headline: </w:t>
       </w:r>
@@ -1166,6 +1389,7 @@
       <w:r>
         <w:rPr>
           <w:b/>
+          <w:color w:val="061B2C"/>
         </w:rPr>
         <w:t xml:space="preserve">Event type: </w:t>
       </w:r>
@@ -1180,6 +1404,7 @@
       <w:r>
         <w:rPr>
           <w:b/>
+          <w:color w:val="061B2C"/>
         </w:rPr>
         <w:t xml:space="preserve">Date: </w:t>
       </w:r>
@@ -1194,6 +1419,7 @@
       <w:r>
         <w:rPr>
           <w:b/>
+          <w:color w:val="061B2C"/>
         </w:rPr>
         <w:t xml:space="preserve">Meta: </w:t>
       </w:r>
@@ -1216,6 +1442,7 @@
       <w:r>
         <w:rPr>
           <w:b/>
+          <w:color w:val="061B2C"/>
         </w:rPr>
         <w:t xml:space="preserve">Link label: </w:t>
       </w:r>
@@ -1239,6 +1466,7 @@
       <w:r>
         <w:rPr>
           <w:b/>
+          <w:color w:val="061B2C"/>
         </w:rPr>
         <w:t xml:space="preserve">Event type: </w:t>
       </w:r>
@@ -1253,6 +1481,7 @@
       <w:r>
         <w:rPr>
           <w:b/>
+          <w:color w:val="061B2C"/>
         </w:rPr>
         <w:t xml:space="preserve">Date: </w:t>
       </w:r>
@@ -1267,6 +1496,7 @@
       <w:r>
         <w:rPr>
           <w:b/>
+          <w:color w:val="061B2C"/>
         </w:rPr>
         <w:t xml:space="preserve">Meta: </w:t>
       </w:r>
@@ -1289,6 +1519,7 @@
       <w:r>
         <w:rPr>
           <w:b/>
+          <w:color w:val="061B2C"/>
         </w:rPr>
         <w:t xml:space="preserve">Link label: </w:t>
       </w:r>
@@ -1299,6 +1530,9 @@
     <w:p>
       <w:pPr>
         <w:pStyle w:val="Heading1"/>
+        <w:pBdr>
+          <w:bottom w:val="single" w:sz="8" w:space="6" w:color="D3D6DA"/>
+        </w:pBdr>
         <w:spacing w:line="259" w:lineRule="auto"/>
       </w:pPr>
       <w:r>
@@ -1312,6 +1546,7 @@
       <w:r>
         <w:rPr>
           <w:b/>
+          <w:color w:val="061B2C"/>
         </w:rPr>
         <w:t xml:space="preserve">Section label: </w:t>
       </w:r>
@@ -1326,6 +1561,7 @@
       <w:r>
         <w:rPr>
           <w:b/>
+          <w:color w:val="061B2C"/>
         </w:rPr>
         <w:t xml:space="preserve">Headline: </w:t>
       </w:r>
@@ -1340,6 +1576,7 @@
       <w:r>
         <w:rPr>
           <w:b/>
+          <w:color w:val="061B2C"/>
         </w:rPr>
         <w:t xml:space="preserve">Actions: </w:t>
       </w:r>
@@ -1358,6 +1595,9 @@
     <w:p>
       <w:pPr>
         <w:pStyle w:val="Heading1"/>
+        <w:pBdr>
+          <w:bottom w:val="single" w:sz="8" w:space="6" w:color="D3D6DA"/>
+        </w:pBdr>
         <w:spacing w:line="259" w:lineRule="auto"/>
       </w:pPr>
       <w:r>
@@ -1371,6 +1611,7 @@
       <w:r>
         <w:rPr>
           <w:b/>
+          <w:color w:val="061B2C"/>
         </w:rPr>
         <w:t xml:space="preserve">Section label: </w:t>
       </w:r>
@@ -1385,6 +1626,7 @@
       <w:r>
         <w:rPr>
           <w:b/>
+          <w:color w:val="061B2C"/>
         </w:rPr>
         <w:t xml:space="preserve">Headline: </w:t>
       </w:r>
@@ -1452,6 +1694,7 @@
       <w:r>
         <w:rPr>
           <w:b/>
+          <w:color w:val="061B2C"/>
         </w:rPr>
         <w:t xml:space="preserve">Form fields: </w:t>
       </w:r>
@@ -1466,6 +1709,7 @@
       <w:r>
         <w:rPr>
           <w:b/>
+          <w:color w:val="061B2C"/>
         </w:rPr>
         <w:t xml:space="preserve">Submit button: </w:t>
       </w:r>
@@ -1476,6 +1720,9 @@
     <w:p>
       <w:pPr>
         <w:pStyle w:val="Heading1"/>
+        <w:pBdr>
+          <w:bottom w:val="single" w:sz="8" w:space="6" w:color="D3D6DA"/>
+        </w:pBdr>
         <w:spacing w:line="259" w:lineRule="auto"/>
       </w:pPr>
       <w:r>
@@ -1500,6 +1747,7 @@
       <w:r>
         <w:rPr>
           <w:b/>
+          <w:color w:val="061B2C"/>
         </w:rPr>
         <w:t xml:space="preserve">Attribution: </w:t>
       </w:r>
@@ -1525,6 +1773,7 @@
       <w:r>
         <w:rPr>
           <w:b/>
+          <w:color w:val="061B2C"/>
         </w:rPr>
         <w:t xml:space="preserve">Attribution: </w:t>
       </w:r>
@@ -1550,6 +1799,7 @@
       <w:r>
         <w:rPr>
           <w:b/>
+          <w:color w:val="061B2C"/>
         </w:rPr>
         <w:t xml:space="preserve">Attribution: </w:t>
       </w:r>
@@ -1575,6 +1825,7 @@
       <w:r>
         <w:rPr>
           <w:b/>
+          <w:color w:val="061B2C"/>
         </w:rPr>
         <w:t xml:space="preserve">Attribution: </w:t>
       </w:r>
@@ -1600,6 +1851,7 @@
       <w:r>
         <w:rPr>
           <w:b/>
+          <w:color w:val="061B2C"/>
         </w:rPr>
         <w:t xml:space="preserve">Attribution: </w:t>
       </w:r>
@@ -1625,6 +1877,7 @@
       <w:r>
         <w:rPr>
           <w:b/>
+          <w:color w:val="061B2C"/>
         </w:rPr>
         <w:t xml:space="preserve">Attribution: </w:t>
       </w:r>
@@ -1635,6 +1888,9 @@
     <w:p>
       <w:pPr>
         <w:pStyle w:val="Heading1"/>
+        <w:pBdr>
+          <w:bottom w:val="single" w:sz="8" w:space="6" w:color="D3D6DA"/>
+        </w:pBdr>
         <w:spacing w:line="259" w:lineRule="auto"/>
       </w:pPr>
       <w:r>
@@ -1755,6 +2011,7 @@
       </w:r>
     </w:p>
     <w:sectPr>
+      <w:footerReference w:type="default" r:id="rId9"/>
       <w:pgSz w:w="12240" w:h="15840"/>
       <w:pgMar w:top="1152" w:right="1224" w:bottom="1080" w:left="1224" w:header="720" w:footer="720" w:gutter="0"/>
       <w:cols w:space="720"/>
@@ -1762,6 +2019,25 @@
     </w:sectPr>
   </w:body>
 </w:document>
+</file>
+
+<file path=word/footer1.xml><?xml version="1.0" encoding="utf-8"?>
+<w:ftr xmlns:m="http://schemas.openxmlformats.org/officeDocument/2006/math" xmlns:mc="http://schemas.openxmlformats.org/markup-compatibility/2006" xmlns:mo="http://schemas.microsoft.com/office/mac/office/2008/main" xmlns:mv="urn:schemas-microsoft-com:mac:vml" xmlns:o="urn:schemas-microsoft-com:office:office" xmlns:r="http://schemas.openxmlformats.org/officeDocument/2006/relationships" xmlns:v="urn:schemas-microsoft-com:vml" xmlns:w10="urn:schemas-microsoft-com:office:word" xmlns:w14="http://schemas.microsoft.com/office/word/2010/wordml" xmlns:w="http://schemas.openxmlformats.org/wordprocessingml/2006/main" xmlns:wne="http://schemas.microsoft.com/office/word/2006/wordml" xmlns:wp14="http://schemas.microsoft.com/office/word/2010/wordprocessingDrawing" xmlns:wp="http://schemas.openxmlformats.org/drawingml/2006/wordprocessingDrawing" xmlns:wpc="http://schemas.microsoft.com/office/word/2010/wordprocessingCanvas" xmlns:wpg="http://schemas.microsoft.com/office/word/2010/wordprocessingGroup" xmlns:wpi="http://schemas.microsoft.com/office/word/2010/wordprocessingInk" xmlns:wps="http://schemas.microsoft.com/office/word/2010/wordprocessingShape" mc:Ignorable="w14 wp14">
+  <w:p>
+    <w:pPr>
+      <w:pStyle w:val="Footer"/>
+      <w:jc w:val="center"/>
+    </w:pPr>
+    <w:r>
+      <w:rPr>
+        <w:rFonts w:ascii="Arial" w:hAnsi="Arial"/>
+        <w:color w:val="56646F"/>
+        <w:sz w:val="17"/>
+      </w:rPr>
+      <w:t>FounderNexus copy review</w:t>
+    </w:r>
+  </w:p>
+</w:ftr>
 </file>
 
 <file path=word/numbering.xml><?xml version="1.0" encoding="utf-8"?>
@@ -2197,7 +2473,7 @@
       <w:rFonts w:asciiTheme="majorHAnsi" w:eastAsiaTheme="majorEastAsia" w:hAnsiTheme="majorHAnsi" w:cstheme="majorBidi" w:ascii="Arial" w:hAnsi="Arial"/>
       <w:b/>
       <w:bCs/>
-      <w:color w:val="0F2B46"/>
+      <w:color w:val="01052A"/>
       <w:sz w:val="30"/>
       <w:szCs w:val="28"/>
     </w:rPr>
@@ -2221,7 +2497,7 @@
       <w:rFonts w:asciiTheme="majorHAnsi" w:eastAsiaTheme="majorEastAsia" w:hAnsiTheme="majorHAnsi" w:cstheme="majorBidi" w:ascii="Arial" w:hAnsi="Arial"/>
       <w:b/>
       <w:bCs/>
-      <w:color w:val="165C9E"/>
+      <w:color w:val="007BE4"/>
       <w:sz w:val="24"/>
       <w:szCs w:val="26"/>
     </w:rPr>
@@ -2245,7 +2521,7 @@
       <w:rFonts w:asciiTheme="majorHAnsi" w:eastAsiaTheme="majorEastAsia" w:hAnsiTheme="majorHAnsi" w:cstheme="majorBidi" w:ascii="Arial" w:hAnsi="Arial"/>
       <w:b/>
       <w:bCs/>
-      <w:color w:val="0F2B46"/>
+      <w:color w:val="061B2C"/>
       <w:sz w:val="22"/>
     </w:rPr>
   </w:style>

</xml_diff>